<commit_message>
Java collection interview Q&A is modified.
</commit_message>
<xml_diff>
--- a/SpringBootInterviewQ&A.docx
+++ b/SpringBootInterviewQ&A.docx
@@ -34,15 +34,6 @@
           <w:szCs w:val="24"/>
         </w:rPr>
       </w:pPr>
-      <w:r>
-        <w:rPr>
-          <w:rFonts w:ascii="Times New Roman" w:hAnsi="Times New Roman" w:cs="Times New Roman"/>
-          <w:b/>
-          <w:sz w:val="24"/>
-          <w:szCs w:val="24"/>
-        </w:rPr>
-        <w:t xml:space="preserve">1. </w:t>
-      </w:r>
       <w:r>
         <w:rPr>
           <w:rFonts w:ascii="Times New Roman" w:hAnsi="Times New Roman" w:cs="Times New Roman"/>
@@ -571,7 +562,7 @@
           <w:sz w:val="24"/>
           <w:szCs w:val="24"/>
         </w:rPr>
-        <w:t>2. What will happens when we remove @</w:t>
+        <w:t>What will happens when we remove @</w:t>
       </w:r>
       <w:proofErr w:type="spellStart"/>
       <w:r>
@@ -715,7 +706,7 @@
           <w:sz w:val="24"/>
           <w:szCs w:val="24"/>
         </w:rPr>
-        <w:t xml:space="preserve">3. What will happens when </w:t>
+        <w:t xml:space="preserve">What will happens when </w:t>
       </w:r>
       <w:proofErr w:type="spellStart"/>
       <w:r>
@@ -1088,7 +1079,7 @@
           <w:sz w:val="24"/>
           <w:szCs w:val="24"/>
         </w:rPr>
-        <w:t>4. How does Spring</w:t>
+        <w:t>How does Spring</w:t>
       </w:r>
       <w:r>
         <w:rPr>
@@ -1284,7 +1275,7 @@
           <w:sz w:val="24"/>
           <w:szCs w:val="24"/>
         </w:rPr>
-        <w:t>5. What happens internally when we add spring-boot-starter-parent dependency in the project?</w:t>
+        <w:t>What happens internally when we add spring-boot-starter-parent dependency in the project?</w:t>
       </w:r>
     </w:p>
     <w:p>
@@ -1788,7 +1779,7 @@
           <w:sz w:val="24"/>
           <w:szCs w:val="24"/>
         </w:rPr>
-        <w:t xml:space="preserve">6. How does Spring Boot load </w:t>
+        <w:t xml:space="preserve">How does Spring Boot load </w:t>
       </w:r>
       <w:proofErr w:type="spellStart"/>
       <w:r>
@@ -2433,6 +2424,7 @@
           <w:szCs w:val="24"/>
         </w:rPr>
       </w:pPr>
+      <w:proofErr w:type="gramStart"/>
       <w:r>
         <w:rPr>
           <w:rFonts w:ascii="Times New Roman" w:hAnsi="Times New Roman" w:cs="Times New Roman"/>
@@ -2440,7 +2432,7 @@
           <w:sz w:val="24"/>
           <w:szCs w:val="24"/>
         </w:rPr>
-        <w:t>7. Difference between @</w:t>
+        <w:t>Difference between @</w:t>
       </w:r>
       <w:proofErr w:type="spellStart"/>
       <w:r>
@@ -2482,6 +2474,7 @@
         </w:rPr>
         <w:t xml:space="preserve"> annotations?</w:t>
       </w:r>
+      <w:proofErr w:type="gramEnd"/>
     </w:p>
     <w:p>
       <w:pPr>
@@ -2824,58 +2817,17 @@
     <w:p>
       <w:pPr>
         <w:spacing w:after="0"/>
-        <w:rPr>
-          <w:rFonts w:ascii="Times New Roman" w:hAnsi="Times New Roman" w:cs="Times New Roman"/>
-          <w:b/>
-          <w:sz w:val="24"/>
-          <w:szCs w:val="24"/>
-        </w:rPr>
-      </w:pPr>
-      <w:r>
-        <w:rPr>
-          <w:rFonts w:ascii="Times New Roman" w:hAnsi="Times New Roman" w:cs="Times New Roman"/>
-          <w:b/>
-          <w:sz w:val="24"/>
-          <w:szCs w:val="24"/>
-        </w:rPr>
-        <w:t>8. How does Spring Boot detect embedded Tomcat automatically?</w:t>
-      </w:r>
+        <w:ind w:left="720"/>
+        <w:rPr>
+          <w:rFonts w:ascii="Times New Roman" w:hAnsi="Times New Roman" w:cs="Times New Roman"/>
+          <w:sz w:val="24"/>
+          <w:szCs w:val="24"/>
+        </w:rPr>
+      </w:pPr>
     </w:p>
     <w:p>
       <w:pPr>
         <w:spacing w:after="0"/>
-        <w:rPr>
-          <w:rFonts w:ascii="Times New Roman" w:hAnsi="Times New Roman" w:cs="Times New Roman"/>
-          <w:b/>
-          <w:sz w:val="24"/>
-          <w:szCs w:val="24"/>
-        </w:rPr>
-      </w:pPr>
-    </w:p>
-    <w:p>
-      <w:pPr>
-        <w:spacing w:after="0"/>
-        <w:ind w:left="720"/>
-        <w:rPr>
-          <w:rFonts w:ascii="Times New Roman" w:hAnsi="Times New Roman" w:cs="Times New Roman"/>
-          <w:sz w:val="24"/>
-          <w:szCs w:val="24"/>
-        </w:rPr>
-      </w:pPr>
-    </w:p>
-    <w:p>
-      <w:pPr>
-        <w:spacing w:after="0"/>
-        <w:rPr>
-          <w:rFonts w:ascii="Times New Roman" w:hAnsi="Times New Roman" w:cs="Times New Roman"/>
-          <w:sz w:val="24"/>
-          <w:szCs w:val="24"/>
-        </w:rPr>
-      </w:pPr>
-    </w:p>
-    <w:p>
-      <w:pPr>
-        <w:ind w:left="360"/>
         <w:rPr>
           <w:rFonts w:ascii="Times New Roman" w:hAnsi="Times New Roman" w:cs="Times New Roman"/>
           <w:sz w:val="24"/>

</xml_diff>

<commit_message>
notes file are changes
</commit_message>
<xml_diff>
--- a/SpringBootInterviewQ&A.docx
+++ b/SpringBootInterviewQ&A.docx
@@ -820,16 +820,14 @@
         </w:rPr>
         <w:t xml:space="preserve"> Creation - It will intelligently </w:t>
       </w:r>
-      <w:proofErr w:type="gramStart"/>
-      <w:r>
-        <w:rPr>
-          <w:rFonts w:ascii="Times New Roman" w:hAnsi="Times New Roman" w:cs="Times New Roman"/>
-          <w:sz w:val="24"/>
-          <w:szCs w:val="24"/>
-        </w:rPr>
-        <w:t>determines</w:t>
-      </w:r>
-      <w:proofErr w:type="gramEnd"/>
+      <w:r>
+        <w:rPr>
+          <w:rFonts w:ascii="Times New Roman" w:hAnsi="Times New Roman" w:cs="Times New Roman"/>
+          <w:sz w:val="24"/>
+          <w:szCs w:val="24"/>
+        </w:rPr>
+        <w:t>determine</w:t>
+      </w:r>
       <w:r>
         <w:rPr>
           <w:rFonts w:ascii="Times New Roman" w:hAnsi="Times New Roman" w:cs="Times New Roman"/>
@@ -1088,7 +1086,16 @@
           <w:sz w:val="24"/>
           <w:szCs w:val="24"/>
         </w:rPr>
-        <w:t xml:space="preserve"> B</w:t>
+        <w:t xml:space="preserve"> </w:t>
+      </w:r>
+      <w:r>
+        <w:rPr>
+          <w:rFonts w:ascii="Times New Roman" w:hAnsi="Times New Roman" w:cs="Times New Roman"/>
+          <w:b/>
+          <w:sz w:val="24"/>
+          <w:szCs w:val="24"/>
+        </w:rPr>
+        <w:t>B</w:t>
       </w:r>
       <w:r>
         <w:rPr>
@@ -1779,7 +1786,25 @@
           <w:sz w:val="24"/>
           <w:szCs w:val="24"/>
         </w:rPr>
-        <w:t xml:space="preserve">How does Spring Boot load </w:t>
+        <w:t>How does Spring</w:t>
+      </w:r>
+      <w:r>
+        <w:rPr>
+          <w:rFonts w:ascii="Times New Roman" w:hAnsi="Times New Roman" w:cs="Times New Roman"/>
+          <w:b/>
+          <w:sz w:val="24"/>
+          <w:szCs w:val="24"/>
+        </w:rPr>
+        <w:t xml:space="preserve"> </w:t>
+      </w:r>
+      <w:r>
+        <w:rPr>
+          <w:rFonts w:ascii="Times New Roman" w:hAnsi="Times New Roman" w:cs="Times New Roman"/>
+          <w:b/>
+          <w:sz w:val="24"/>
+          <w:szCs w:val="24"/>
+        </w:rPr>
+        <w:t xml:space="preserve">Boot load </w:t>
       </w:r>
       <w:proofErr w:type="spellStart"/>
       <w:r>
@@ -2424,7 +2449,6 @@
           <w:szCs w:val="24"/>
         </w:rPr>
       </w:pPr>
-      <w:proofErr w:type="gramStart"/>
       <w:r>
         <w:rPr>
           <w:rFonts w:ascii="Times New Roman" w:hAnsi="Times New Roman" w:cs="Times New Roman"/>
@@ -2432,9 +2456,8 @@
           <w:sz w:val="24"/>
           <w:szCs w:val="24"/>
         </w:rPr>
-        <w:t>Difference between @</w:t>
-      </w:r>
-      <w:proofErr w:type="spellStart"/>
+        <w:t>What are the d</w:t>
+      </w:r>
       <w:r>
         <w:rPr>
           <w:rFonts w:ascii="Times New Roman" w:hAnsi="Times New Roman" w:cs="Times New Roman"/>
@@ -2442,6 +2465,34 @@
           <w:sz w:val="24"/>
           <w:szCs w:val="24"/>
         </w:rPr>
+        <w:t>ifference</w:t>
+      </w:r>
+      <w:r>
+        <w:rPr>
+          <w:rFonts w:ascii="Times New Roman" w:hAnsi="Times New Roman" w:cs="Times New Roman"/>
+          <w:b/>
+          <w:sz w:val="24"/>
+          <w:szCs w:val="24"/>
+        </w:rPr>
+        <w:t>s</w:t>
+      </w:r>
+      <w:r>
+        <w:rPr>
+          <w:rFonts w:ascii="Times New Roman" w:hAnsi="Times New Roman" w:cs="Times New Roman"/>
+          <w:b/>
+          <w:sz w:val="24"/>
+          <w:szCs w:val="24"/>
+        </w:rPr>
+        <w:t xml:space="preserve"> between @</w:t>
+      </w:r>
+      <w:proofErr w:type="spellStart"/>
+      <w:r>
+        <w:rPr>
+          <w:rFonts w:ascii="Times New Roman" w:hAnsi="Times New Roman" w:cs="Times New Roman"/>
+          <w:b/>
+          <w:sz w:val="24"/>
+          <w:szCs w:val="24"/>
+        </w:rPr>
         <w:t>ComponentScan</w:t>
       </w:r>
       <w:proofErr w:type="spellEnd"/>
@@ -2474,7 +2525,6 @@
         </w:rPr>
         <w:t xml:space="preserve"> annotations?</w:t>
       </w:r>
-      <w:proofErr w:type="gramEnd"/>
     </w:p>
     <w:p>
       <w:pPr>
@@ -2813,6 +2863,268 @@
         </w:rPr>
         <w:t>3. It is belongs to Spring Boot Framework.</w:t>
       </w:r>
+    </w:p>
+    <w:p>
+      <w:pPr>
+        <w:spacing w:after="0"/>
+        <w:rPr>
+          <w:rFonts w:ascii="Times New Roman" w:hAnsi="Times New Roman" w:cs="Times New Roman"/>
+          <w:b/>
+          <w:sz w:val="24"/>
+          <w:szCs w:val="24"/>
+        </w:rPr>
+      </w:pPr>
+      <w:r>
+        <w:rPr>
+          <w:rFonts w:ascii="Times New Roman" w:hAnsi="Times New Roman" w:cs="Times New Roman"/>
+          <w:b/>
+          <w:sz w:val="24"/>
+          <w:szCs w:val="24"/>
+        </w:rPr>
+        <w:t xml:space="preserve">How does Spring Boot detect embedded </w:t>
+      </w:r>
+      <w:proofErr w:type="spellStart"/>
+      <w:r>
+        <w:rPr>
+          <w:rFonts w:ascii="Times New Roman" w:hAnsi="Times New Roman" w:cs="Times New Roman"/>
+          <w:b/>
+          <w:sz w:val="24"/>
+          <w:szCs w:val="24"/>
+        </w:rPr>
+        <w:t>Tomact</w:t>
+      </w:r>
+      <w:proofErr w:type="spellEnd"/>
+      <w:r>
+        <w:rPr>
+          <w:rFonts w:ascii="Times New Roman" w:hAnsi="Times New Roman" w:cs="Times New Roman"/>
+          <w:b/>
+          <w:sz w:val="24"/>
+          <w:szCs w:val="24"/>
+        </w:rPr>
+        <w:t xml:space="preserve"> automatically?</w:t>
+      </w:r>
+    </w:p>
+    <w:p>
+      <w:pPr>
+        <w:pStyle w:val="ListParagraph"/>
+        <w:numPr>
+          <w:ilvl w:val="0"/>
+          <w:numId w:val="24"/>
+        </w:numPr>
+        <w:spacing w:after="0"/>
+        <w:rPr>
+          <w:rFonts w:ascii="Times New Roman" w:hAnsi="Times New Roman" w:cs="Times New Roman"/>
+          <w:sz w:val="24"/>
+          <w:szCs w:val="24"/>
+        </w:rPr>
+      </w:pPr>
+      <w:r>
+        <w:rPr>
+          <w:rFonts w:ascii="Times New Roman" w:hAnsi="Times New Roman" w:cs="Times New Roman"/>
+          <w:sz w:val="24"/>
+          <w:szCs w:val="24"/>
+        </w:rPr>
+        <w:lastRenderedPageBreak/>
+        <w:t xml:space="preserve">Spring Boot detects an embedded tomcat automatically because of the spring-boot-starter-web dependency bring tomcat-embed-core onto the </w:t>
+      </w:r>
+      <w:proofErr w:type="spellStart"/>
+      <w:r>
+        <w:rPr>
+          <w:rFonts w:ascii="Times New Roman" w:hAnsi="Times New Roman" w:cs="Times New Roman"/>
+          <w:sz w:val="24"/>
+          <w:szCs w:val="24"/>
+        </w:rPr>
+        <w:t>classpath</w:t>
+      </w:r>
+      <w:proofErr w:type="spellEnd"/>
+      <w:r>
+        <w:rPr>
+          <w:rFonts w:ascii="Times New Roman" w:hAnsi="Times New Roman" w:cs="Times New Roman"/>
+          <w:sz w:val="24"/>
+          <w:szCs w:val="24"/>
+        </w:rPr>
+        <w:t>.</w:t>
+      </w:r>
+    </w:p>
+    <w:p>
+      <w:pPr>
+        <w:pStyle w:val="ListParagraph"/>
+        <w:numPr>
+          <w:ilvl w:val="0"/>
+          <w:numId w:val="24"/>
+        </w:numPr>
+        <w:spacing w:after="0"/>
+        <w:rPr>
+          <w:rFonts w:ascii="Times New Roman" w:hAnsi="Times New Roman" w:cs="Times New Roman"/>
+          <w:sz w:val="24"/>
+          <w:szCs w:val="24"/>
+        </w:rPr>
+      </w:pPr>
+      <w:r>
+        <w:rPr>
+          <w:rFonts w:ascii="Times New Roman" w:hAnsi="Times New Roman" w:cs="Times New Roman"/>
+          <w:sz w:val="24"/>
+          <w:szCs w:val="24"/>
+        </w:rPr>
+        <w:t xml:space="preserve">During the application startup, Spring Boot load auto-configuration </w:t>
+      </w:r>
+      <w:proofErr w:type="spellStart"/>
+      <w:r>
+        <w:rPr>
+          <w:rFonts w:ascii="Times New Roman" w:hAnsi="Times New Roman" w:cs="Times New Roman"/>
+          <w:sz w:val="24"/>
+          <w:szCs w:val="24"/>
+        </w:rPr>
+        <w:t>ServletWebServerFactoryAutoConfiguration</w:t>
+      </w:r>
+      <w:proofErr w:type="spellEnd"/>
+      <w:r>
+        <w:rPr>
+          <w:rFonts w:ascii="Times New Roman" w:hAnsi="Times New Roman" w:cs="Times New Roman"/>
+          <w:sz w:val="24"/>
+          <w:szCs w:val="24"/>
+        </w:rPr>
+        <w:t xml:space="preserve"> classes from 'META-INF/</w:t>
+      </w:r>
+      <w:proofErr w:type="spellStart"/>
+      <w:r>
+        <w:rPr>
+          <w:rFonts w:ascii="Times New Roman" w:hAnsi="Times New Roman" w:cs="Times New Roman"/>
+          <w:sz w:val="24"/>
+          <w:szCs w:val="24"/>
+        </w:rPr>
+        <w:t>spring.factories</w:t>
+      </w:r>
+      <w:proofErr w:type="spellEnd"/>
+      <w:r>
+        <w:rPr>
+          <w:rFonts w:ascii="Times New Roman" w:hAnsi="Times New Roman" w:cs="Times New Roman"/>
+          <w:sz w:val="24"/>
+          <w:szCs w:val="24"/>
+        </w:rPr>
+        <w:t xml:space="preserve">.' location for Spring Boot 2.7 or before versions, after Spring Boot 3.x it will loads from 'META-INF/spring/org.springframework.boot.autoconfigure.AutoConfiguration.imports.' </w:t>
+      </w:r>
+      <w:proofErr w:type="spellStart"/>
+      <w:r>
+        <w:rPr>
+          <w:rFonts w:ascii="Times New Roman" w:hAnsi="Times New Roman" w:cs="Times New Roman"/>
+          <w:sz w:val="24"/>
+          <w:szCs w:val="24"/>
+        </w:rPr>
+        <w:t>localtion</w:t>
+      </w:r>
+      <w:proofErr w:type="spellEnd"/>
+      <w:r>
+        <w:rPr>
+          <w:rFonts w:ascii="Times New Roman" w:hAnsi="Times New Roman" w:cs="Times New Roman"/>
+          <w:sz w:val="24"/>
+          <w:szCs w:val="24"/>
+        </w:rPr>
+        <w:t>.</w:t>
+      </w:r>
+    </w:p>
+    <w:p>
+      <w:pPr>
+        <w:pStyle w:val="ListParagraph"/>
+        <w:numPr>
+          <w:ilvl w:val="0"/>
+          <w:numId w:val="24"/>
+        </w:numPr>
+        <w:rPr>
+          <w:rFonts w:ascii="Times New Roman" w:hAnsi="Times New Roman" w:cs="Times New Roman"/>
+          <w:sz w:val="24"/>
+          <w:szCs w:val="24"/>
+        </w:rPr>
+      </w:pPr>
+      <w:r>
+        <w:rPr>
+          <w:rFonts w:ascii="Times New Roman" w:hAnsi="Times New Roman" w:cs="Times New Roman"/>
+          <w:sz w:val="24"/>
+          <w:szCs w:val="24"/>
+        </w:rPr>
+        <w:t>And check the @</w:t>
+      </w:r>
+      <w:proofErr w:type="spellStart"/>
+      <w:r>
+        <w:rPr>
+          <w:rFonts w:ascii="Times New Roman" w:hAnsi="Times New Roman" w:cs="Times New Roman"/>
+          <w:sz w:val="24"/>
+          <w:szCs w:val="24"/>
+        </w:rPr>
+        <w:t>ConditionalOnClass</w:t>
+      </w:r>
+      <w:proofErr w:type="spellEnd"/>
+      <w:r>
+        <w:rPr>
+          <w:rFonts w:ascii="Times New Roman" w:hAnsi="Times New Roman" w:cs="Times New Roman"/>
+          <w:sz w:val="24"/>
+          <w:szCs w:val="24"/>
+        </w:rPr>
+        <w:t xml:space="preserve"> annotation with </w:t>
+      </w:r>
+      <w:proofErr w:type="spellStart"/>
+      <w:r>
+        <w:rPr>
+          <w:rFonts w:ascii="Times New Roman" w:hAnsi="Times New Roman" w:cs="Times New Roman"/>
+          <w:sz w:val="24"/>
+          <w:szCs w:val="24"/>
+        </w:rPr>
+        <w:t>Tomcat.class</w:t>
+      </w:r>
+      <w:proofErr w:type="spellEnd"/>
+      <w:r>
+        <w:rPr>
+          <w:rFonts w:ascii="Times New Roman" w:hAnsi="Times New Roman" w:cs="Times New Roman"/>
+          <w:sz w:val="24"/>
+          <w:szCs w:val="24"/>
+        </w:rPr>
+        <w:t xml:space="preserve">, if it find then will create </w:t>
+      </w:r>
+      <w:proofErr w:type="spellStart"/>
+      <w:r>
+        <w:rPr>
+          <w:rFonts w:ascii="Times New Roman" w:hAnsi="Times New Roman" w:cs="Times New Roman"/>
+          <w:sz w:val="24"/>
+          <w:szCs w:val="24"/>
+        </w:rPr>
+        <w:t>TomcatServletWebServerFactory</w:t>
+      </w:r>
+      <w:proofErr w:type="spellEnd"/>
+      <w:r>
+        <w:rPr>
+          <w:rFonts w:ascii="Times New Roman" w:hAnsi="Times New Roman" w:cs="Times New Roman"/>
+          <w:sz w:val="24"/>
+          <w:szCs w:val="24"/>
+        </w:rPr>
+        <w:t xml:space="preserve"> class bean, this factory class start the embedded tomcat server and register the </w:t>
+      </w:r>
+      <w:proofErr w:type="spellStart"/>
+      <w:r>
+        <w:rPr>
+          <w:rFonts w:ascii="Times New Roman" w:hAnsi="Times New Roman" w:cs="Times New Roman"/>
+          <w:sz w:val="24"/>
+          <w:szCs w:val="24"/>
+        </w:rPr>
+        <w:t>DispatcherServlet</w:t>
+      </w:r>
+      <w:proofErr w:type="spellEnd"/>
+      <w:r>
+        <w:rPr>
+          <w:rFonts w:ascii="Times New Roman" w:hAnsi="Times New Roman" w:cs="Times New Roman"/>
+          <w:sz w:val="24"/>
+          <w:szCs w:val="24"/>
+        </w:rPr>
+        <w:t>.</w:t>
+      </w:r>
+    </w:p>
+    <w:p>
+      <w:pPr>
+        <w:rPr>
+          <w:rFonts w:ascii="Times New Roman" w:hAnsi="Times New Roman" w:cs="Times New Roman"/>
+          <w:sz w:val="24"/>
+          <w:szCs w:val="24"/>
+        </w:rPr>
+      </w:pPr>
     </w:p>
     <w:p>
       <w:pPr>
@@ -4655,6 +4967,119 @@
     </w:lvl>
   </w:abstractNum>
   <w:abstractNum w:abstractNumId="17">
+    <w:nsid w:val="5A583A17"/>
+    <w:multiLevelType w:val="hybridMultilevel"/>
+    <w:tmpl w:val="A4980D04"/>
+    <w:lvl w:ilvl="0" w:tplc="865C1090">
+      <w:start w:val="1"/>
+      <w:numFmt w:val="bullet"/>
+      <w:lvlText w:val=""/>
+      <w:lvlJc w:val="left"/>
+      <w:pPr>
+        <w:ind w:left="720" w:hanging="360"/>
+      </w:pPr>
+      <w:rPr>
+        <w:rFonts w:ascii="Symbol" w:hAnsi="Symbol" w:hint="default"/>
+      </w:rPr>
+    </w:lvl>
+    <w:lvl w:ilvl="1" w:tplc="04090003" w:tentative="1">
+      <w:start w:val="1"/>
+      <w:numFmt w:val="bullet"/>
+      <w:lvlText w:val="o"/>
+      <w:lvlJc w:val="left"/>
+      <w:pPr>
+        <w:ind w:left="1440" w:hanging="360"/>
+      </w:pPr>
+      <w:rPr>
+        <w:rFonts w:ascii="Courier New" w:hAnsi="Courier New" w:cs="Courier New" w:hint="default"/>
+      </w:rPr>
+    </w:lvl>
+    <w:lvl w:ilvl="2" w:tplc="04090005" w:tentative="1">
+      <w:start w:val="1"/>
+      <w:numFmt w:val="bullet"/>
+      <w:lvlText w:val=""/>
+      <w:lvlJc w:val="left"/>
+      <w:pPr>
+        <w:ind w:left="2160" w:hanging="360"/>
+      </w:pPr>
+      <w:rPr>
+        <w:rFonts w:ascii="Wingdings" w:hAnsi="Wingdings" w:hint="default"/>
+      </w:rPr>
+    </w:lvl>
+    <w:lvl w:ilvl="3" w:tplc="04090001" w:tentative="1">
+      <w:start w:val="1"/>
+      <w:numFmt w:val="bullet"/>
+      <w:lvlText w:val=""/>
+      <w:lvlJc w:val="left"/>
+      <w:pPr>
+        <w:ind w:left="2880" w:hanging="360"/>
+      </w:pPr>
+      <w:rPr>
+        <w:rFonts w:ascii="Symbol" w:hAnsi="Symbol" w:hint="default"/>
+      </w:rPr>
+    </w:lvl>
+    <w:lvl w:ilvl="4" w:tplc="04090003" w:tentative="1">
+      <w:start w:val="1"/>
+      <w:numFmt w:val="bullet"/>
+      <w:lvlText w:val="o"/>
+      <w:lvlJc w:val="left"/>
+      <w:pPr>
+        <w:ind w:left="3600" w:hanging="360"/>
+      </w:pPr>
+      <w:rPr>
+        <w:rFonts w:ascii="Courier New" w:hAnsi="Courier New" w:cs="Courier New" w:hint="default"/>
+      </w:rPr>
+    </w:lvl>
+    <w:lvl w:ilvl="5" w:tplc="04090005" w:tentative="1">
+      <w:start w:val="1"/>
+      <w:numFmt w:val="bullet"/>
+      <w:lvlText w:val=""/>
+      <w:lvlJc w:val="left"/>
+      <w:pPr>
+        <w:ind w:left="4320" w:hanging="360"/>
+      </w:pPr>
+      <w:rPr>
+        <w:rFonts w:ascii="Wingdings" w:hAnsi="Wingdings" w:hint="default"/>
+      </w:rPr>
+    </w:lvl>
+    <w:lvl w:ilvl="6" w:tplc="04090001" w:tentative="1">
+      <w:start w:val="1"/>
+      <w:numFmt w:val="bullet"/>
+      <w:lvlText w:val=""/>
+      <w:lvlJc w:val="left"/>
+      <w:pPr>
+        <w:ind w:left="5040" w:hanging="360"/>
+      </w:pPr>
+      <w:rPr>
+        <w:rFonts w:ascii="Symbol" w:hAnsi="Symbol" w:hint="default"/>
+      </w:rPr>
+    </w:lvl>
+    <w:lvl w:ilvl="7" w:tplc="04090003" w:tentative="1">
+      <w:start w:val="1"/>
+      <w:numFmt w:val="bullet"/>
+      <w:lvlText w:val="o"/>
+      <w:lvlJc w:val="left"/>
+      <w:pPr>
+        <w:ind w:left="5760" w:hanging="360"/>
+      </w:pPr>
+      <w:rPr>
+        <w:rFonts w:ascii="Courier New" w:hAnsi="Courier New" w:cs="Courier New" w:hint="default"/>
+      </w:rPr>
+    </w:lvl>
+    <w:lvl w:ilvl="8" w:tplc="04090005" w:tentative="1">
+      <w:start w:val="1"/>
+      <w:numFmt w:val="bullet"/>
+      <w:lvlText w:val=""/>
+      <w:lvlJc w:val="left"/>
+      <w:pPr>
+        <w:ind w:left="6480" w:hanging="360"/>
+      </w:pPr>
+      <w:rPr>
+        <w:rFonts w:ascii="Wingdings" w:hAnsi="Wingdings" w:hint="default"/>
+      </w:rPr>
+    </w:lvl>
+  </w:abstractNum>
+  <w:abstractNum w:abstractNumId="18">
     <w:nsid w:val="5F8402F7"/>
     <w:multiLevelType w:val="hybridMultilevel"/>
     <w:tmpl w:val="058C30CE"/>
@@ -4766,7 +5191,7 @@
       </w:rPr>
     </w:lvl>
   </w:abstractNum>
-  <w:abstractNum w:abstractNumId="18">
+  <w:abstractNum w:abstractNumId="19">
     <w:nsid w:val="7618554C"/>
     <w:multiLevelType w:val="hybridMultilevel"/>
     <w:tmpl w:val="A69E7626"/>
@@ -4879,7 +5304,7 @@
       </w:rPr>
     </w:lvl>
   </w:abstractNum>
-  <w:abstractNum w:abstractNumId="19">
+  <w:abstractNum w:abstractNumId="20">
     <w:nsid w:val="76445B38"/>
     <w:multiLevelType w:val="hybridMultilevel"/>
     <w:tmpl w:val="DAAEDD7A"/>
@@ -4991,7 +5416,7 @@
       </w:rPr>
     </w:lvl>
   </w:abstractNum>
-  <w:abstractNum w:abstractNumId="20">
+  <w:abstractNum w:abstractNumId="21">
     <w:nsid w:val="79E35857"/>
     <w:multiLevelType w:val="hybridMultilevel"/>
     <w:tmpl w:val="83F278C0"/>
@@ -5104,7 +5529,7 @@
       </w:rPr>
     </w:lvl>
   </w:abstractNum>
-  <w:abstractNum w:abstractNumId="21">
+  <w:abstractNum w:abstractNumId="22">
     <w:nsid w:val="7BA2468E"/>
     <w:multiLevelType w:val="hybridMultilevel"/>
     <w:tmpl w:val="15EEB6BC"/>
@@ -5217,7 +5642,7 @@
       </w:rPr>
     </w:lvl>
   </w:abstractNum>
-  <w:abstractNum w:abstractNumId="22">
+  <w:abstractNum w:abstractNumId="23">
     <w:nsid w:val="7DBF4D6C"/>
     <w:multiLevelType w:val="hybridMultilevel"/>
     <w:tmpl w:val="AC70BD5A"/>
@@ -5345,28 +5770,28 @@
     <w:abstractNumId w:val="3"/>
   </w:num>
   <w:num w:numId="6">
-    <w:abstractNumId w:val="17"/>
+    <w:abstractNumId w:val="18"/>
   </w:num>
   <w:num w:numId="7">
-    <w:abstractNumId w:val="21"/>
+    <w:abstractNumId w:val="22"/>
   </w:num>
   <w:num w:numId="8">
-    <w:abstractNumId w:val="22"/>
+    <w:abstractNumId w:val="23"/>
   </w:num>
   <w:num w:numId="9">
     <w:abstractNumId w:val="6"/>
   </w:num>
   <w:num w:numId="10">
-    <w:abstractNumId w:val="19"/>
+    <w:abstractNumId w:val="20"/>
   </w:num>
   <w:num w:numId="11">
-    <w:abstractNumId w:val="18"/>
+    <w:abstractNumId w:val="19"/>
   </w:num>
   <w:num w:numId="12">
     <w:abstractNumId w:val="13"/>
   </w:num>
   <w:num w:numId="13">
-    <w:abstractNumId w:val="20"/>
+    <w:abstractNumId w:val="21"/>
   </w:num>
   <w:num w:numId="14">
     <w:abstractNumId w:val="2"/>
@@ -5397,6 +5822,9 @@
   </w:num>
   <w:num w:numId="23">
     <w:abstractNumId w:val="15"/>
+  </w:num>
+  <w:num w:numId="24">
+    <w:abstractNumId w:val="17"/>
   </w:num>
 </w:numbering>
 </file>

</xml_diff>